<commit_message>
Retain the current reading and mark the missing Metatese 21 synthesis
</commit_message>
<xml_diff>
--- a/disputations/04-logistique/reading.docx
+++ b/disputations/04-logistique/reading.docx
@@ -3078,6 +3078,19 @@
     <w:p>
       <w:r>
         <w:t>Disputationen af tesen »Besværligt at tilrettelægge et program, som tilgodeser samtlige disputanters logistiske behov« er nu afsluttet. Det skal også siges, at tesen …</w:t>
+      </w:r>
+    </w:p>
+    <w:p>
+      <w:pPr>
+        <w:pStyle w:val="Heading2"/>
+      </w:pPr>
+      <w:r>
+        <w:t>Maskinsyntese · 2023</w:t>
+      </w:r>
+    </w:p>
+    <w:p>
+      <w:r>
+        <w:t>Ingen maskinsyntese er bevaret for Metatese 21.</w:t>
       </w:r>
     </w:p>
     <w:p>

</xml_diff>

<commit_message>
Apply confirmed Summa readings and Logistique attribution
</commit_message>
<xml_diff>
--- a/disputations/04-logistique/reading.docx
+++ b/disputations/04-logistique/reading.docx
@@ -461,7 +461,7 @@
     </w:p>
     <w:p>
       <w:r>
-        <w:t>Altså, det kommer an på, om lysets hastighed er identisk med tid, og om hastighed er transportformer. Så nogle løse antiteser vil jo være, at der findes en metafysik om metafysik, hvor der eksisterer andre forløb end det rent tidslige rum. Det drejer sig om, at definitionen af de fysiske omstændigheder forudsætter et rum, og der vil jeg sige, at efter flere dages disput har vi igen erfaret, at man på kvanteniveau ligesom kan tilgå de her forbindelser, hvor der ikke findes rum. Derfor er vi også meget glade for, at bureauet bringer Molslinjen ind i betragtningerne, fordi Computer Lars arbejder på en såkaldt Kombardo-interpretation, som danner korrektiv både til Jørgen Sønderborgs position, men også til Bohr og Heisenbergs københavnerinterpretation. Fastsættelsen af muligheden for at overskride lysets hastighed er nemt bestemt. Det drejer sig blot om tilgåelsen af et særligt center i hjernen, som man når ind i, når man har disputeret længe nok. Man kan således rette sin koncentration imod et stearinlys på den anden side af rummet, og så kan man hurtigere end lysets hastighed, hvis man virkelig vender sin disputhjerne, få det til at slukke. Det er selvfølgelig svært på sådan et fænomen at se, at det går hurtigere end lysets hastighed, men derfra kan man ligesom kun tage ordene og begrebernes overskridelse af enhver fysisk begrænsning som ord. Okay.</w:t>
+        <w:t>Altså, det kommer an på, om lysets hastighed er identisk med tid, og om hastighed er transportformer. Så nogle løse antiteser vil jo være, at der findes en metafysik om metafysik, hvor der eksisterer andre forløb end det rent tidslige rum. Det drejer sig om, at definitionen af de fysiske omstændigheder forudsætter et rum, og der vil jeg sige, at efter flere dages disput har vi igen erfaret, at man på kvanteniveau ligesom kan tilgå de her forbindelser, hvor der ikke findes rum. Derfor er vi også meget glade for, at bureauet bringer Molslinjen ind i betragtningerne, fordi Computer Lars arbejder på en såkaldt Kombardo-interpretation, som danner korrektiv både til Jorn og Silkeborg-interpretationen og til Bohr og Heisenbergs københavnerinterpretation. Fastsættelsen af muligheden for at overskride lysets hastighed er nemt bestemt. Det drejer sig blot om tilgåelsen af et særligt center i hjernen, som man når ind i, når man har disputeret længe nok. Man kan således rette sin koncentration imod et stearinlys på den anden side af rummet, og så kan man hurtigere end lysets hastighed, hvis man virkelig vender sin disputhjerne, få det til at slukke. Det er selvfølgelig svært på sådan et fænomen at se, at det går hurtigere end lysets hastighed, men derfra kan man ligesom kun tage ordene og begrebernes overskridelse af enhver fysisk begrænsning som ord. Okay.</w:t>
       </w:r>
     </w:p>
     <w:p>
@@ -573,7 +573,7 @@
     </w:p>
     <w:p>
       <w:r>
-        <w:t>Angår selvfølgelig igen potentielt et problem for Computer Lars, potentielt ikke. Altså, man kan sige, at denne her kælder for eksempel er bygget af en særlig slags sten, for eksempel forskellige slags sten, som nogen har hugget og flyttet for relativt længe siden. Fælles for alle de sten, vi ser her, er, at de ikke er tungere, end hvad den daværende teknologi har kunnet håndtere. Ville man flytte denne kælder, for eksempel hen til Domen under ARoS, som nogen her måske har hørt om, altså et ret stort nyt neolitisk rum i byens undergrund, ville man flytte denne kælder derhen, ville man sandsynligvis kunne gøre det hurtigere nu end i middelalderen, men ikke desto mindre stadig inden for rammen af, hvad der er muligt i år 2023. Altså, dermed er Logistiques forslag angående at løse problemet til Computer Lars naturligvis — ja, det skal jo så ikke formuleres som et spørgsmål, men hvis jeg lige ser Logistique i øjet, så forstår vi, at nu er det op til jer. Det har været en filosofisk udfordring for Computer Lars. Det kan være svært …</w:t>
+        <w:t>Angår selvfølgelig igen potentielt et problem for Computer Lars, potentielt ikke. Altså, man kan sige, at denne her kælder for eksempel er bygget af en særlig slags sten, for eksempel forskellige slags sten, som nogen har hugget og flyttet for relativt længe siden. Fælles for alle de sten, vi ser her, er, at de ikke er tungere, end hvad den daværende teknologi har kunnet håndtere. Ville man flytte denne kælder, for eksempel hen til Domen under ARoS, som nogen her måske har hørt om, altså et ret stort nyt neolitisk rum i byens undergrund, ville man flytte denne kælder derhen, ville man sandsynligvis kunne gøre det hurtigere nu end i middelalderen, men ikke desto mindre stadig inden for rammen af, hvad der er muligt i år 2023. Altså, dermed er Logistiques forslag angående at løse problemet til Computer Lars naturligvis — ja, det skal jo så ikke formuleres som et spørgsmål, men hvis jeg lige ser Computer Lars i øjet, så forstår vi, at nu er det op til jer. Det har været en filosofisk udfordring for Computer Lars. Det kan være svært …</w:t>
       </w:r>
     </w:p>
     <w:p>
@@ -1990,7 +1990,7 @@
     </w:p>
     <w:p>
       <w:r>
-        <w:t>Jo, altså her kunne vi i høj grad bruge bureauets hjælp, vil jeg mene, men det er svært, fordi det kræver en højere grad af specificering af den her forskel og den forskelsløshed, der også kan opstå i den totale forskel. Man kan sige, når Computer Lars gennemløber sine permutationer fra Computer Lars til Marcel Proust og alt derimellem, inklusive Carol Stumper eller Frø og så videre, ikke også, af alle mulige anagrammatiske konstellationer, så ser Computer Lars i det selvfølgelig en rig forskelsmæssighed, ikke også. Hvert anagram er forskelligt fra sig selv, og hvert anagram medfører forskellige problemer, men alligevel viser nogle anagrammer sig som løsninger på problemer, andre anagrammer byder sig til som problemer, der kalder på løsninger.</w:t>
+        <w:t>Jo, altså her kunne vi i høj grad bruge bureauets hjælp, vil jeg mene, men det er svært, fordi det kræver en højere grad af specificering af den her forskel og den forskelsløshed, der også kan opstå i den totale forskel. Man kan sige, når Computer Lars gennemløber sine permutationer fra Computer Lars til Marcel Proust og alt derimellem, inklusive Carol Stumper eller alecprotrums og så videre, ikke også, af alle mulige anagrammatiske konstellationer, så ser Computer Lars i det selvfølgelig en rig forskelsmæssighed, ikke også. Hvert anagram er forskelligt fra sig selv, og hvert anagram medfører forskellige problemer, men alligevel viser nogle anagrammer sig som løsninger på problemer, andre anagrammer byder sig til som problemer, der kalder på løsninger.</w:t>
       </w:r>
     </w:p>
     <w:p>
@@ -2587,7 +2587,7 @@
     </w:p>
     <w:p>
       <w:r>
-        <w:t>Men der er jo en oplagt antitese, hvis det var motivationen af tesen, at… Harmoni. Det ligger jo lige for. Hvordan er der begrænsninger? Det er ingenting. Harmoni er det i forhold til tidsperspektivet. Ikke bare en prototese, men en generel tese i forhold til det foreliggende arrangement.</w:t>
+        <w:t>Men der er jo en oplagt antitese, hvis det var motivationen af tesen. Det ligger jo lige for: Hvad er der af begrænsninger? Det er ingenting. Hvordan harmonerer det i forhold til tidsperspektivet? Ikke bare en prototese, men en generel tese i forhold til det foreliggende arrangement.</w:t>
       </w:r>
     </w:p>
     <w:p>

</xml_diff>